<commit_message>
Update all benchmarks with two-column layout preservation and add Tesseract OCR
- Add Tesseract OCR benchmark (rasterize + OCR + DOCX pipeline)
- Add two-column MSA layout preservation (v2) to PyMuPDF, pdfplumber,
  Camelot, Docling, and Tesseract using spatial coordinate column detection
- Add text similarity metrics (seq_match, word_recall, char_ratio) for
  OCR accuracy and layout quality measurement
- Add text similarity to LibreOffice benchmark
- Add final_comparison.ipynb with cross-library charts and heatmap
- Re-run all 7 notebooks with fresh results
- Reorganize outputs into per-library folders
- Rewrite README with comprehensive comparison tables

Co-Authored-By: Claude Opus 4.6 <noreply@anthropic.com>
</commit_message>
<xml_diff>
--- a/outputs/pdfplumber/text_only.docx
+++ b/outputs/pdfplumber/text_only.docx
@@ -15,63 +15,63 @@
         <w:rPr>
           <w:sz w:val="20"/>
         </w:rPr>
-        <w:t>This is line 1 of page 1. Lorem ipsum dolor sit amet, consectetur adipiscing elit. Sed do</w:t>
-      </w:r>
-    </w:p>
-    <w:p>
-      <w:r>
-        <w:rPr>
-          <w:sz w:val="20"/>
-        </w:rPr>
-        <w:t>This is line 2 of page 1. Lorem ipsum dolor sit amet, consectetur adipiscing elit. Sed do</w:t>
-      </w:r>
-    </w:p>
-    <w:p>
-      <w:r>
-        <w:rPr>
-          <w:sz w:val="20"/>
-        </w:rPr>
-        <w:t>This is line 3 of page 1. Lorem ipsum dolor sit amet, consectetur adipiscing elit. Sed do</w:t>
-      </w:r>
-    </w:p>
-    <w:p>
-      <w:r>
-        <w:rPr>
-          <w:sz w:val="20"/>
-        </w:rPr>
-        <w:t>This is line 4 of page 1. Lorem ipsum dolor sit amet, consectetur adipiscing elit. Sed do</w:t>
-      </w:r>
-    </w:p>
-    <w:p>
-      <w:r>
-        <w:rPr>
-          <w:sz w:val="20"/>
-        </w:rPr>
-        <w:t>This is line 5 of page 1. Lorem ipsum dolor sit amet, consectetur adipiscing elit. Sed do</w:t>
-      </w:r>
-    </w:p>
-    <w:p>
-      <w:r>
-        <w:rPr>
-          <w:sz w:val="20"/>
-        </w:rPr>
-        <w:t>This is line 6 of page 1. Lorem ipsum dolor sit amet, consectetur adipiscing elit. Sed do</w:t>
-      </w:r>
-    </w:p>
-    <w:p>
-      <w:r>
-        <w:rPr>
-          <w:sz w:val="20"/>
-        </w:rPr>
-        <w:t>This is line 7 of page 1. Lorem ipsum dolor sit amet, consectetur adipiscing elit. Sed do</w:t>
-      </w:r>
-    </w:p>
-    <w:p>
-      <w:r>
-        <w:rPr>
-          <w:sz w:val="20"/>
-        </w:rPr>
-        <w:t>This is line 8 of page 1. Lorem ipsum dolor sit amet, consectetur adipiscing elit. Sed do</w:t>
+        <w:t xml:space="preserve">This is line 1 of page 1. Lorem ipsum dolor sit amet, consectetur adipiscing elit. Sed do </w:t>
+      </w:r>
+    </w:p>
+    <w:p>
+      <w:r>
+        <w:rPr>
+          <w:sz w:val="20"/>
+        </w:rPr>
+        <w:t xml:space="preserve">This is line 2 of page 1. Lorem ipsum dolor sit amet, consectetur adipiscing elit. Sed do </w:t>
+      </w:r>
+    </w:p>
+    <w:p>
+      <w:r>
+        <w:rPr>
+          <w:sz w:val="20"/>
+        </w:rPr>
+        <w:t xml:space="preserve">This is line 3 of page 1. Lorem ipsum dolor sit amet, consectetur adipiscing elit. Sed do </w:t>
+      </w:r>
+    </w:p>
+    <w:p>
+      <w:r>
+        <w:rPr>
+          <w:sz w:val="20"/>
+        </w:rPr>
+        <w:t xml:space="preserve">This is line 4 of page 1. Lorem ipsum dolor sit amet, consectetur adipiscing elit. Sed do </w:t>
+      </w:r>
+    </w:p>
+    <w:p>
+      <w:r>
+        <w:rPr>
+          <w:sz w:val="20"/>
+        </w:rPr>
+        <w:t xml:space="preserve">This is line 5 of page 1. Lorem ipsum dolor sit amet, consectetur adipiscing elit. Sed do </w:t>
+      </w:r>
+    </w:p>
+    <w:p>
+      <w:r>
+        <w:rPr>
+          <w:sz w:val="20"/>
+        </w:rPr>
+        <w:t xml:space="preserve">This is line 6 of page 1. Lorem ipsum dolor sit amet, consectetur adipiscing elit. Sed do </w:t>
+      </w:r>
+    </w:p>
+    <w:p>
+      <w:r>
+        <w:rPr>
+          <w:sz w:val="20"/>
+        </w:rPr>
+        <w:t xml:space="preserve">This is line 7 of page 1. Lorem ipsum dolor sit amet, consectetur adipiscing elit. Sed do </w:t>
+      </w:r>
+    </w:p>
+    <w:p>
+      <w:r>
+        <w:rPr>
+          <w:sz w:val="20"/>
+        </w:rPr>
+        <w:t xml:space="preserve">This is line 8 of page 1. Lorem ipsum dolor sit amet, consectetur adipiscing elit. Sed do </w:t>
       </w:r>
     </w:p>
     <w:p>
@@ -79,7 +79,7 @@
         <w:rPr>
           <w:sz w:val="19"/>
         </w:rPr>
-        <w:t>This is line 9 of page 1. Lorem ipsum dolor sit amet, consectetur adipiscing elit. Sed do</w:t>
+        <w:t xml:space="preserve">This is line 9 of page 1. Lorem ipsum dolor sit amet, consectetur adipiscing elit. Sed do </w:t>
       </w:r>
     </w:p>
     <w:p>
@@ -228,63 +228,63 @@
         <w:rPr>
           <w:sz w:val="20"/>
         </w:rPr>
-        <w:t>This is line 1 of page 2. Lorem ipsum dolor sit amet, consectetur adipiscing elit. Sed do</w:t>
-      </w:r>
-    </w:p>
-    <w:p>
-      <w:r>
-        <w:rPr>
-          <w:sz w:val="20"/>
-        </w:rPr>
-        <w:t>This is line 2 of page 2. Lorem ipsum dolor sit amet, consectetur adipiscing elit. Sed do</w:t>
-      </w:r>
-    </w:p>
-    <w:p>
-      <w:r>
-        <w:rPr>
-          <w:sz w:val="20"/>
-        </w:rPr>
-        <w:t>This is line 3 of page 2. Lorem ipsum dolor sit amet, consectetur adipiscing elit. Sed do</w:t>
-      </w:r>
-    </w:p>
-    <w:p>
-      <w:r>
-        <w:rPr>
-          <w:sz w:val="20"/>
-        </w:rPr>
-        <w:t>This is line 4 of page 2. Lorem ipsum dolor sit amet, consectetur adipiscing elit. Sed do</w:t>
-      </w:r>
-    </w:p>
-    <w:p>
-      <w:r>
-        <w:rPr>
-          <w:sz w:val="20"/>
-        </w:rPr>
-        <w:t>This is line 5 of page 2. Lorem ipsum dolor sit amet, consectetur adipiscing elit. Sed do</w:t>
-      </w:r>
-    </w:p>
-    <w:p>
-      <w:r>
-        <w:rPr>
-          <w:sz w:val="20"/>
-        </w:rPr>
-        <w:t>This is line 6 of page 2. Lorem ipsum dolor sit amet, consectetur adipiscing elit. Sed do</w:t>
-      </w:r>
-    </w:p>
-    <w:p>
-      <w:r>
-        <w:rPr>
-          <w:sz w:val="20"/>
-        </w:rPr>
-        <w:t>This is line 7 of page 2. Lorem ipsum dolor sit amet, consectetur adipiscing elit. Sed do</w:t>
-      </w:r>
-    </w:p>
-    <w:p>
-      <w:r>
-        <w:rPr>
-          <w:sz w:val="20"/>
-        </w:rPr>
-        <w:t>This is line 8 of page 2. Lorem ipsum dolor sit amet, consectetur adipiscing elit. Sed do</w:t>
+        <w:t xml:space="preserve">This is line 1 of page 2. Lorem ipsum dolor sit amet, consectetur adipiscing elit. Sed do </w:t>
+      </w:r>
+    </w:p>
+    <w:p>
+      <w:r>
+        <w:rPr>
+          <w:sz w:val="20"/>
+        </w:rPr>
+        <w:t xml:space="preserve">This is line 2 of page 2. Lorem ipsum dolor sit amet, consectetur adipiscing elit. Sed do </w:t>
+      </w:r>
+    </w:p>
+    <w:p>
+      <w:r>
+        <w:rPr>
+          <w:sz w:val="20"/>
+        </w:rPr>
+        <w:t xml:space="preserve">This is line 3 of page 2. Lorem ipsum dolor sit amet, consectetur adipiscing elit. Sed do </w:t>
+      </w:r>
+    </w:p>
+    <w:p>
+      <w:r>
+        <w:rPr>
+          <w:sz w:val="20"/>
+        </w:rPr>
+        <w:t xml:space="preserve">This is line 4 of page 2. Lorem ipsum dolor sit amet, consectetur adipiscing elit. Sed do </w:t>
+      </w:r>
+    </w:p>
+    <w:p>
+      <w:r>
+        <w:rPr>
+          <w:sz w:val="20"/>
+        </w:rPr>
+        <w:t xml:space="preserve">This is line 5 of page 2. Lorem ipsum dolor sit amet, consectetur adipiscing elit. Sed do </w:t>
+      </w:r>
+    </w:p>
+    <w:p>
+      <w:r>
+        <w:rPr>
+          <w:sz w:val="20"/>
+        </w:rPr>
+        <w:t xml:space="preserve">This is line 6 of page 2. Lorem ipsum dolor sit amet, consectetur adipiscing elit. Sed do </w:t>
+      </w:r>
+    </w:p>
+    <w:p>
+      <w:r>
+        <w:rPr>
+          <w:sz w:val="20"/>
+        </w:rPr>
+        <w:t xml:space="preserve">This is line 7 of page 2. Lorem ipsum dolor sit amet, consectetur adipiscing elit. Sed do </w:t>
+      </w:r>
+    </w:p>
+    <w:p>
+      <w:r>
+        <w:rPr>
+          <w:sz w:val="20"/>
+        </w:rPr>
+        <w:t xml:space="preserve">This is line 8 of page 2. Lorem ipsum dolor sit amet, consectetur adipiscing elit. Sed do </w:t>
       </w:r>
     </w:p>
     <w:p>
@@ -292,7 +292,7 @@
         <w:rPr>
           <w:sz w:val="19"/>
         </w:rPr>
-        <w:t>This is line 9 of page 2. Lorem ipsum dolor sit amet, consectetur adipiscing elit. Sed do</w:t>
+        <w:t xml:space="preserve">This is line 9 of page 2. Lorem ipsum dolor sit amet, consectetur adipiscing elit. Sed do </w:t>
       </w:r>
     </w:p>
     <w:p>
@@ -441,63 +441,63 @@
         <w:rPr>
           <w:sz w:val="20"/>
         </w:rPr>
-        <w:t>This is line 1 of page 3. Lorem ipsum dolor sit amet, consectetur adipiscing elit. Sed do</w:t>
-      </w:r>
-    </w:p>
-    <w:p>
-      <w:r>
-        <w:rPr>
-          <w:sz w:val="20"/>
-        </w:rPr>
-        <w:t>This is line 2 of page 3. Lorem ipsum dolor sit amet, consectetur adipiscing elit. Sed do</w:t>
-      </w:r>
-    </w:p>
-    <w:p>
-      <w:r>
-        <w:rPr>
-          <w:sz w:val="20"/>
-        </w:rPr>
-        <w:t>This is line 3 of page 3. Lorem ipsum dolor sit amet, consectetur adipiscing elit. Sed do</w:t>
-      </w:r>
-    </w:p>
-    <w:p>
-      <w:r>
-        <w:rPr>
-          <w:sz w:val="20"/>
-        </w:rPr>
-        <w:t>This is line 4 of page 3. Lorem ipsum dolor sit amet, consectetur adipiscing elit. Sed do</w:t>
-      </w:r>
-    </w:p>
-    <w:p>
-      <w:r>
-        <w:rPr>
-          <w:sz w:val="20"/>
-        </w:rPr>
-        <w:t>This is line 5 of page 3. Lorem ipsum dolor sit amet, consectetur adipiscing elit. Sed do</w:t>
-      </w:r>
-    </w:p>
-    <w:p>
-      <w:r>
-        <w:rPr>
-          <w:sz w:val="20"/>
-        </w:rPr>
-        <w:t>This is line 6 of page 3. Lorem ipsum dolor sit amet, consectetur adipiscing elit. Sed do</w:t>
-      </w:r>
-    </w:p>
-    <w:p>
-      <w:r>
-        <w:rPr>
-          <w:sz w:val="20"/>
-        </w:rPr>
-        <w:t>This is line 7 of page 3. Lorem ipsum dolor sit amet, consectetur adipiscing elit. Sed do</w:t>
-      </w:r>
-    </w:p>
-    <w:p>
-      <w:r>
-        <w:rPr>
-          <w:sz w:val="20"/>
-        </w:rPr>
-        <w:t>This is line 8 of page 3. Lorem ipsum dolor sit amet, consectetur adipiscing elit. Sed do</w:t>
+        <w:t xml:space="preserve">This is line 1 of page 3. Lorem ipsum dolor sit amet, consectetur adipiscing elit. Sed do </w:t>
+      </w:r>
+    </w:p>
+    <w:p>
+      <w:r>
+        <w:rPr>
+          <w:sz w:val="20"/>
+        </w:rPr>
+        <w:t xml:space="preserve">This is line 2 of page 3. Lorem ipsum dolor sit amet, consectetur adipiscing elit. Sed do </w:t>
+      </w:r>
+    </w:p>
+    <w:p>
+      <w:r>
+        <w:rPr>
+          <w:sz w:val="20"/>
+        </w:rPr>
+        <w:t xml:space="preserve">This is line 3 of page 3. Lorem ipsum dolor sit amet, consectetur adipiscing elit. Sed do </w:t>
+      </w:r>
+    </w:p>
+    <w:p>
+      <w:r>
+        <w:rPr>
+          <w:sz w:val="20"/>
+        </w:rPr>
+        <w:t xml:space="preserve">This is line 4 of page 3. Lorem ipsum dolor sit amet, consectetur adipiscing elit. Sed do </w:t>
+      </w:r>
+    </w:p>
+    <w:p>
+      <w:r>
+        <w:rPr>
+          <w:sz w:val="20"/>
+        </w:rPr>
+        <w:t xml:space="preserve">This is line 5 of page 3. Lorem ipsum dolor sit amet, consectetur adipiscing elit. Sed do </w:t>
+      </w:r>
+    </w:p>
+    <w:p>
+      <w:r>
+        <w:rPr>
+          <w:sz w:val="20"/>
+        </w:rPr>
+        <w:t xml:space="preserve">This is line 6 of page 3. Lorem ipsum dolor sit amet, consectetur adipiscing elit. Sed do </w:t>
+      </w:r>
+    </w:p>
+    <w:p>
+      <w:r>
+        <w:rPr>
+          <w:sz w:val="20"/>
+        </w:rPr>
+        <w:t xml:space="preserve">This is line 7 of page 3. Lorem ipsum dolor sit amet, consectetur adipiscing elit. Sed do </w:t>
+      </w:r>
+    </w:p>
+    <w:p>
+      <w:r>
+        <w:rPr>
+          <w:sz w:val="20"/>
+        </w:rPr>
+        <w:t xml:space="preserve">This is line 8 of page 3. Lorem ipsum dolor sit amet, consectetur adipiscing elit. Sed do </w:t>
       </w:r>
     </w:p>
     <w:p>
@@ -505,7 +505,7 @@
         <w:rPr>
           <w:sz w:val="19"/>
         </w:rPr>
-        <w:t>This is line 9 of page 3. Lorem ipsum dolor sit amet, consectetur adipiscing elit. Sed do</w:t>
+        <w:t xml:space="preserve">This is line 9 of page 3. Lorem ipsum dolor sit amet, consectetur adipiscing elit. Sed do </w:t>
       </w:r>
     </w:p>
     <w:p>
@@ -654,63 +654,63 @@
         <w:rPr>
           <w:sz w:val="20"/>
         </w:rPr>
-        <w:t>This is line 1 of page 4. Lorem ipsum dolor sit amet, consectetur adipiscing elit. Sed do</w:t>
-      </w:r>
-    </w:p>
-    <w:p>
-      <w:r>
-        <w:rPr>
-          <w:sz w:val="20"/>
-        </w:rPr>
-        <w:t>This is line 2 of page 4. Lorem ipsum dolor sit amet, consectetur adipiscing elit. Sed do</w:t>
-      </w:r>
-    </w:p>
-    <w:p>
-      <w:r>
-        <w:rPr>
-          <w:sz w:val="20"/>
-        </w:rPr>
-        <w:t>This is line 3 of page 4. Lorem ipsum dolor sit amet, consectetur adipiscing elit. Sed do</w:t>
-      </w:r>
-    </w:p>
-    <w:p>
-      <w:r>
-        <w:rPr>
-          <w:sz w:val="20"/>
-        </w:rPr>
-        <w:t>This is line 4 of page 4. Lorem ipsum dolor sit amet, consectetur adipiscing elit. Sed do</w:t>
-      </w:r>
-    </w:p>
-    <w:p>
-      <w:r>
-        <w:rPr>
-          <w:sz w:val="20"/>
-        </w:rPr>
-        <w:t>This is line 5 of page 4. Lorem ipsum dolor sit amet, consectetur adipiscing elit. Sed do</w:t>
-      </w:r>
-    </w:p>
-    <w:p>
-      <w:r>
-        <w:rPr>
-          <w:sz w:val="20"/>
-        </w:rPr>
-        <w:t>This is line 6 of page 4. Lorem ipsum dolor sit amet, consectetur adipiscing elit. Sed do</w:t>
-      </w:r>
-    </w:p>
-    <w:p>
-      <w:r>
-        <w:rPr>
-          <w:sz w:val="20"/>
-        </w:rPr>
-        <w:t>This is line 7 of page 4. Lorem ipsum dolor sit amet, consectetur adipiscing elit. Sed do</w:t>
-      </w:r>
-    </w:p>
-    <w:p>
-      <w:r>
-        <w:rPr>
-          <w:sz w:val="20"/>
-        </w:rPr>
-        <w:t>This is line 8 of page 4. Lorem ipsum dolor sit amet, consectetur adipiscing elit. Sed do</w:t>
+        <w:t xml:space="preserve">This is line 1 of page 4. Lorem ipsum dolor sit amet, consectetur adipiscing elit. Sed do </w:t>
+      </w:r>
+    </w:p>
+    <w:p>
+      <w:r>
+        <w:rPr>
+          <w:sz w:val="20"/>
+        </w:rPr>
+        <w:t xml:space="preserve">This is line 2 of page 4. Lorem ipsum dolor sit amet, consectetur adipiscing elit. Sed do </w:t>
+      </w:r>
+    </w:p>
+    <w:p>
+      <w:r>
+        <w:rPr>
+          <w:sz w:val="20"/>
+        </w:rPr>
+        <w:t xml:space="preserve">This is line 3 of page 4. Lorem ipsum dolor sit amet, consectetur adipiscing elit. Sed do </w:t>
+      </w:r>
+    </w:p>
+    <w:p>
+      <w:r>
+        <w:rPr>
+          <w:sz w:val="20"/>
+        </w:rPr>
+        <w:t xml:space="preserve">This is line 4 of page 4. Lorem ipsum dolor sit amet, consectetur adipiscing elit. Sed do </w:t>
+      </w:r>
+    </w:p>
+    <w:p>
+      <w:r>
+        <w:rPr>
+          <w:sz w:val="20"/>
+        </w:rPr>
+        <w:t xml:space="preserve">This is line 5 of page 4. Lorem ipsum dolor sit amet, consectetur adipiscing elit. Sed do </w:t>
+      </w:r>
+    </w:p>
+    <w:p>
+      <w:r>
+        <w:rPr>
+          <w:sz w:val="20"/>
+        </w:rPr>
+        <w:t xml:space="preserve">This is line 6 of page 4. Lorem ipsum dolor sit amet, consectetur adipiscing elit. Sed do </w:t>
+      </w:r>
+    </w:p>
+    <w:p>
+      <w:r>
+        <w:rPr>
+          <w:sz w:val="20"/>
+        </w:rPr>
+        <w:t xml:space="preserve">This is line 7 of page 4. Lorem ipsum dolor sit amet, consectetur adipiscing elit. Sed do </w:t>
+      </w:r>
+    </w:p>
+    <w:p>
+      <w:r>
+        <w:rPr>
+          <w:sz w:val="20"/>
+        </w:rPr>
+        <w:t xml:space="preserve">This is line 8 of page 4. Lorem ipsum dolor sit amet, consectetur adipiscing elit. Sed do </w:t>
       </w:r>
     </w:p>
     <w:p>
@@ -718,7 +718,7 @@
         <w:rPr>
           <w:sz w:val="19"/>
         </w:rPr>
-        <w:t>This is line 9 of page 4. Lorem ipsum dolor sit amet, consectetur adipiscing elit. Sed do</w:t>
+        <w:t xml:space="preserve">This is line 9 of page 4. Lorem ipsum dolor sit amet, consectetur adipiscing elit. Sed do </w:t>
       </w:r>
     </w:p>
     <w:p>
@@ -867,63 +867,63 @@
         <w:rPr>
           <w:sz w:val="20"/>
         </w:rPr>
-        <w:t>This is line 1 of page 5. Lorem ipsum dolor sit amet, consectetur adipiscing elit. Sed do</w:t>
-      </w:r>
-    </w:p>
-    <w:p>
-      <w:r>
-        <w:rPr>
-          <w:sz w:val="20"/>
-        </w:rPr>
-        <w:t>This is line 2 of page 5. Lorem ipsum dolor sit amet, consectetur adipiscing elit. Sed do</w:t>
-      </w:r>
-    </w:p>
-    <w:p>
-      <w:r>
-        <w:rPr>
-          <w:sz w:val="20"/>
-        </w:rPr>
-        <w:t>This is line 3 of page 5. Lorem ipsum dolor sit amet, consectetur adipiscing elit. Sed do</w:t>
-      </w:r>
-    </w:p>
-    <w:p>
-      <w:r>
-        <w:rPr>
-          <w:sz w:val="20"/>
-        </w:rPr>
-        <w:t>This is line 4 of page 5. Lorem ipsum dolor sit amet, consectetur adipiscing elit. Sed do</w:t>
-      </w:r>
-    </w:p>
-    <w:p>
-      <w:r>
-        <w:rPr>
-          <w:sz w:val="20"/>
-        </w:rPr>
-        <w:t>This is line 5 of page 5. Lorem ipsum dolor sit amet, consectetur adipiscing elit. Sed do</w:t>
-      </w:r>
-    </w:p>
-    <w:p>
-      <w:r>
-        <w:rPr>
-          <w:sz w:val="20"/>
-        </w:rPr>
-        <w:t>This is line 6 of page 5. Lorem ipsum dolor sit amet, consectetur adipiscing elit. Sed do</w:t>
-      </w:r>
-    </w:p>
-    <w:p>
-      <w:r>
-        <w:rPr>
-          <w:sz w:val="20"/>
-        </w:rPr>
-        <w:t>This is line 7 of page 5. Lorem ipsum dolor sit amet, consectetur adipiscing elit. Sed do</w:t>
-      </w:r>
-    </w:p>
-    <w:p>
-      <w:r>
-        <w:rPr>
-          <w:sz w:val="20"/>
-        </w:rPr>
-        <w:t>This is line 8 of page 5. Lorem ipsum dolor sit amet, consectetur adipiscing elit. Sed do</w:t>
+        <w:t xml:space="preserve">This is line 1 of page 5. Lorem ipsum dolor sit amet, consectetur adipiscing elit. Sed do </w:t>
+      </w:r>
+    </w:p>
+    <w:p>
+      <w:r>
+        <w:rPr>
+          <w:sz w:val="20"/>
+        </w:rPr>
+        <w:t xml:space="preserve">This is line 2 of page 5. Lorem ipsum dolor sit amet, consectetur adipiscing elit. Sed do </w:t>
+      </w:r>
+    </w:p>
+    <w:p>
+      <w:r>
+        <w:rPr>
+          <w:sz w:val="20"/>
+        </w:rPr>
+        <w:t xml:space="preserve">This is line 3 of page 5. Lorem ipsum dolor sit amet, consectetur adipiscing elit. Sed do </w:t>
+      </w:r>
+    </w:p>
+    <w:p>
+      <w:r>
+        <w:rPr>
+          <w:sz w:val="20"/>
+        </w:rPr>
+        <w:t xml:space="preserve">This is line 4 of page 5. Lorem ipsum dolor sit amet, consectetur adipiscing elit. Sed do </w:t>
+      </w:r>
+    </w:p>
+    <w:p>
+      <w:r>
+        <w:rPr>
+          <w:sz w:val="20"/>
+        </w:rPr>
+        <w:t xml:space="preserve">This is line 5 of page 5. Lorem ipsum dolor sit amet, consectetur adipiscing elit. Sed do </w:t>
+      </w:r>
+    </w:p>
+    <w:p>
+      <w:r>
+        <w:rPr>
+          <w:sz w:val="20"/>
+        </w:rPr>
+        <w:t xml:space="preserve">This is line 6 of page 5. Lorem ipsum dolor sit amet, consectetur adipiscing elit. Sed do </w:t>
+      </w:r>
+    </w:p>
+    <w:p>
+      <w:r>
+        <w:rPr>
+          <w:sz w:val="20"/>
+        </w:rPr>
+        <w:t xml:space="preserve">This is line 7 of page 5. Lorem ipsum dolor sit amet, consectetur adipiscing elit. Sed do </w:t>
+      </w:r>
+    </w:p>
+    <w:p>
+      <w:r>
+        <w:rPr>
+          <w:sz w:val="20"/>
+        </w:rPr>
+        <w:t xml:space="preserve">This is line 8 of page 5. Lorem ipsum dolor sit amet, consectetur adipiscing elit. Sed do </w:t>
       </w:r>
     </w:p>
     <w:p>
@@ -931,7 +931,7 @@
         <w:rPr>
           <w:sz w:val="19"/>
         </w:rPr>
-        <w:t>This is line 9 of page 5. Lorem ipsum dolor sit amet, consectetur adipiscing elit. Sed do</w:t>
+        <w:t xml:space="preserve">This is line 9 of page 5. Lorem ipsum dolor sit amet, consectetur adipiscing elit. Sed do </w:t>
       </w:r>
     </w:p>
     <w:p>
@@ -1080,63 +1080,63 @@
         <w:rPr>
           <w:sz w:val="20"/>
         </w:rPr>
-        <w:t>This is line 1 of page 6. Lorem ipsum dolor sit amet, consectetur adipiscing elit. Sed do</w:t>
-      </w:r>
-    </w:p>
-    <w:p>
-      <w:r>
-        <w:rPr>
-          <w:sz w:val="20"/>
-        </w:rPr>
-        <w:t>This is line 2 of page 6. Lorem ipsum dolor sit amet, consectetur adipiscing elit. Sed do</w:t>
-      </w:r>
-    </w:p>
-    <w:p>
-      <w:r>
-        <w:rPr>
-          <w:sz w:val="20"/>
-        </w:rPr>
-        <w:t>This is line 3 of page 6. Lorem ipsum dolor sit amet, consectetur adipiscing elit. Sed do</w:t>
-      </w:r>
-    </w:p>
-    <w:p>
-      <w:r>
-        <w:rPr>
-          <w:sz w:val="20"/>
-        </w:rPr>
-        <w:t>This is line 4 of page 6. Lorem ipsum dolor sit amet, consectetur adipiscing elit. Sed do</w:t>
-      </w:r>
-    </w:p>
-    <w:p>
-      <w:r>
-        <w:rPr>
-          <w:sz w:val="20"/>
-        </w:rPr>
-        <w:t>This is line 5 of page 6. Lorem ipsum dolor sit amet, consectetur adipiscing elit. Sed do</w:t>
-      </w:r>
-    </w:p>
-    <w:p>
-      <w:r>
-        <w:rPr>
-          <w:sz w:val="20"/>
-        </w:rPr>
-        <w:t>This is line 6 of page 6. Lorem ipsum dolor sit amet, consectetur adipiscing elit. Sed do</w:t>
-      </w:r>
-    </w:p>
-    <w:p>
-      <w:r>
-        <w:rPr>
-          <w:sz w:val="20"/>
-        </w:rPr>
-        <w:t>This is line 7 of page 6. Lorem ipsum dolor sit amet, consectetur adipiscing elit. Sed do</w:t>
-      </w:r>
-    </w:p>
-    <w:p>
-      <w:r>
-        <w:rPr>
-          <w:sz w:val="20"/>
-        </w:rPr>
-        <w:t>This is line 8 of page 6. Lorem ipsum dolor sit amet, consectetur adipiscing elit. Sed do</w:t>
+        <w:t xml:space="preserve">This is line 1 of page 6. Lorem ipsum dolor sit amet, consectetur adipiscing elit. Sed do </w:t>
+      </w:r>
+    </w:p>
+    <w:p>
+      <w:r>
+        <w:rPr>
+          <w:sz w:val="20"/>
+        </w:rPr>
+        <w:t xml:space="preserve">This is line 2 of page 6. Lorem ipsum dolor sit amet, consectetur adipiscing elit. Sed do </w:t>
+      </w:r>
+    </w:p>
+    <w:p>
+      <w:r>
+        <w:rPr>
+          <w:sz w:val="20"/>
+        </w:rPr>
+        <w:t xml:space="preserve">This is line 3 of page 6. Lorem ipsum dolor sit amet, consectetur adipiscing elit. Sed do </w:t>
+      </w:r>
+    </w:p>
+    <w:p>
+      <w:r>
+        <w:rPr>
+          <w:sz w:val="20"/>
+        </w:rPr>
+        <w:t xml:space="preserve">This is line 4 of page 6. Lorem ipsum dolor sit amet, consectetur adipiscing elit. Sed do </w:t>
+      </w:r>
+    </w:p>
+    <w:p>
+      <w:r>
+        <w:rPr>
+          <w:sz w:val="20"/>
+        </w:rPr>
+        <w:t xml:space="preserve">This is line 5 of page 6. Lorem ipsum dolor sit amet, consectetur adipiscing elit. Sed do </w:t>
+      </w:r>
+    </w:p>
+    <w:p>
+      <w:r>
+        <w:rPr>
+          <w:sz w:val="20"/>
+        </w:rPr>
+        <w:t xml:space="preserve">This is line 6 of page 6. Lorem ipsum dolor sit amet, consectetur adipiscing elit. Sed do </w:t>
+      </w:r>
+    </w:p>
+    <w:p>
+      <w:r>
+        <w:rPr>
+          <w:sz w:val="20"/>
+        </w:rPr>
+        <w:t xml:space="preserve">This is line 7 of page 6. Lorem ipsum dolor sit amet, consectetur adipiscing elit. Sed do </w:t>
+      </w:r>
+    </w:p>
+    <w:p>
+      <w:r>
+        <w:rPr>
+          <w:sz w:val="20"/>
+        </w:rPr>
+        <w:t xml:space="preserve">This is line 8 of page 6. Lorem ipsum dolor sit amet, consectetur adipiscing elit. Sed do </w:t>
       </w:r>
     </w:p>
     <w:p>
@@ -1144,7 +1144,7 @@
         <w:rPr>
           <w:sz w:val="19"/>
         </w:rPr>
-        <w:t>This is line 9 of page 6. Lorem ipsum dolor sit amet, consectetur adipiscing elit. Sed do</w:t>
+        <w:t xml:space="preserve">This is line 9 of page 6. Lorem ipsum dolor sit amet, consectetur adipiscing elit. Sed do </w:t>
       </w:r>
     </w:p>
     <w:p>
@@ -1293,63 +1293,63 @@
         <w:rPr>
           <w:sz w:val="20"/>
         </w:rPr>
-        <w:t>This is line 1 of page 7. Lorem ipsum dolor sit amet, consectetur adipiscing elit. Sed do</w:t>
-      </w:r>
-    </w:p>
-    <w:p>
-      <w:r>
-        <w:rPr>
-          <w:sz w:val="20"/>
-        </w:rPr>
-        <w:t>This is line 2 of page 7. Lorem ipsum dolor sit amet, consectetur adipiscing elit. Sed do</w:t>
-      </w:r>
-    </w:p>
-    <w:p>
-      <w:r>
-        <w:rPr>
-          <w:sz w:val="20"/>
-        </w:rPr>
-        <w:t>This is line 3 of page 7. Lorem ipsum dolor sit amet, consectetur adipiscing elit. Sed do</w:t>
-      </w:r>
-    </w:p>
-    <w:p>
-      <w:r>
-        <w:rPr>
-          <w:sz w:val="20"/>
-        </w:rPr>
-        <w:t>This is line 4 of page 7. Lorem ipsum dolor sit amet, consectetur adipiscing elit. Sed do</w:t>
-      </w:r>
-    </w:p>
-    <w:p>
-      <w:r>
-        <w:rPr>
-          <w:sz w:val="20"/>
-        </w:rPr>
-        <w:t>This is line 5 of page 7. Lorem ipsum dolor sit amet, consectetur adipiscing elit. Sed do</w:t>
-      </w:r>
-    </w:p>
-    <w:p>
-      <w:r>
-        <w:rPr>
-          <w:sz w:val="20"/>
-        </w:rPr>
-        <w:t>This is line 6 of page 7. Lorem ipsum dolor sit amet, consectetur adipiscing elit. Sed do</w:t>
-      </w:r>
-    </w:p>
-    <w:p>
-      <w:r>
-        <w:rPr>
-          <w:sz w:val="20"/>
-        </w:rPr>
-        <w:t>This is line 7 of page 7. Lorem ipsum dolor sit amet, consectetur adipiscing elit. Sed do</w:t>
-      </w:r>
-    </w:p>
-    <w:p>
-      <w:r>
-        <w:rPr>
-          <w:sz w:val="20"/>
-        </w:rPr>
-        <w:t>This is line 8 of page 7. Lorem ipsum dolor sit amet, consectetur adipiscing elit. Sed do</w:t>
+        <w:t xml:space="preserve">This is line 1 of page 7. Lorem ipsum dolor sit amet, consectetur adipiscing elit. Sed do </w:t>
+      </w:r>
+    </w:p>
+    <w:p>
+      <w:r>
+        <w:rPr>
+          <w:sz w:val="20"/>
+        </w:rPr>
+        <w:t xml:space="preserve">This is line 2 of page 7. Lorem ipsum dolor sit amet, consectetur adipiscing elit. Sed do </w:t>
+      </w:r>
+    </w:p>
+    <w:p>
+      <w:r>
+        <w:rPr>
+          <w:sz w:val="20"/>
+        </w:rPr>
+        <w:t xml:space="preserve">This is line 3 of page 7. Lorem ipsum dolor sit amet, consectetur adipiscing elit. Sed do </w:t>
+      </w:r>
+    </w:p>
+    <w:p>
+      <w:r>
+        <w:rPr>
+          <w:sz w:val="20"/>
+        </w:rPr>
+        <w:t xml:space="preserve">This is line 4 of page 7. Lorem ipsum dolor sit amet, consectetur adipiscing elit. Sed do </w:t>
+      </w:r>
+    </w:p>
+    <w:p>
+      <w:r>
+        <w:rPr>
+          <w:sz w:val="20"/>
+        </w:rPr>
+        <w:t xml:space="preserve">This is line 5 of page 7. Lorem ipsum dolor sit amet, consectetur adipiscing elit. Sed do </w:t>
+      </w:r>
+    </w:p>
+    <w:p>
+      <w:r>
+        <w:rPr>
+          <w:sz w:val="20"/>
+        </w:rPr>
+        <w:t xml:space="preserve">This is line 6 of page 7. Lorem ipsum dolor sit amet, consectetur adipiscing elit. Sed do </w:t>
+      </w:r>
+    </w:p>
+    <w:p>
+      <w:r>
+        <w:rPr>
+          <w:sz w:val="20"/>
+        </w:rPr>
+        <w:t xml:space="preserve">This is line 7 of page 7. Lorem ipsum dolor sit amet, consectetur adipiscing elit. Sed do </w:t>
+      </w:r>
+    </w:p>
+    <w:p>
+      <w:r>
+        <w:rPr>
+          <w:sz w:val="20"/>
+        </w:rPr>
+        <w:t xml:space="preserve">This is line 8 of page 7. Lorem ipsum dolor sit amet, consectetur adipiscing elit. Sed do </w:t>
       </w:r>
     </w:p>
     <w:p>
@@ -1357,7 +1357,7 @@
         <w:rPr>
           <w:sz w:val="19"/>
         </w:rPr>
-        <w:t>This is line 9 of page 7. Lorem ipsum dolor sit amet, consectetur adipiscing elit. Sed do</w:t>
+        <w:t xml:space="preserve">This is line 9 of page 7. Lorem ipsum dolor sit amet, consectetur adipiscing elit. Sed do </w:t>
       </w:r>
     </w:p>
     <w:p>
@@ -1506,63 +1506,63 @@
         <w:rPr>
           <w:sz w:val="20"/>
         </w:rPr>
-        <w:t>This is line 1 of page 8. Lorem ipsum dolor sit amet, consectetur adipiscing elit. Sed do</w:t>
-      </w:r>
-    </w:p>
-    <w:p>
-      <w:r>
-        <w:rPr>
-          <w:sz w:val="20"/>
-        </w:rPr>
-        <w:t>This is line 2 of page 8. Lorem ipsum dolor sit amet, consectetur adipiscing elit. Sed do</w:t>
-      </w:r>
-    </w:p>
-    <w:p>
-      <w:r>
-        <w:rPr>
-          <w:sz w:val="20"/>
-        </w:rPr>
-        <w:t>This is line 3 of page 8. Lorem ipsum dolor sit amet, consectetur adipiscing elit. Sed do</w:t>
-      </w:r>
-    </w:p>
-    <w:p>
-      <w:r>
-        <w:rPr>
-          <w:sz w:val="20"/>
-        </w:rPr>
-        <w:t>This is line 4 of page 8. Lorem ipsum dolor sit amet, consectetur adipiscing elit. Sed do</w:t>
-      </w:r>
-    </w:p>
-    <w:p>
-      <w:r>
-        <w:rPr>
-          <w:sz w:val="20"/>
-        </w:rPr>
-        <w:t>This is line 5 of page 8. Lorem ipsum dolor sit amet, consectetur adipiscing elit. Sed do</w:t>
-      </w:r>
-    </w:p>
-    <w:p>
-      <w:r>
-        <w:rPr>
-          <w:sz w:val="20"/>
-        </w:rPr>
-        <w:t>This is line 6 of page 8. Lorem ipsum dolor sit amet, consectetur adipiscing elit. Sed do</w:t>
-      </w:r>
-    </w:p>
-    <w:p>
-      <w:r>
-        <w:rPr>
-          <w:sz w:val="20"/>
-        </w:rPr>
-        <w:t>This is line 7 of page 8. Lorem ipsum dolor sit amet, consectetur adipiscing elit. Sed do</w:t>
-      </w:r>
-    </w:p>
-    <w:p>
-      <w:r>
-        <w:rPr>
-          <w:sz w:val="20"/>
-        </w:rPr>
-        <w:t>This is line 8 of page 8. Lorem ipsum dolor sit amet, consectetur adipiscing elit. Sed do</w:t>
+        <w:t xml:space="preserve">This is line 1 of page 8. Lorem ipsum dolor sit amet, consectetur adipiscing elit. Sed do </w:t>
+      </w:r>
+    </w:p>
+    <w:p>
+      <w:r>
+        <w:rPr>
+          <w:sz w:val="20"/>
+        </w:rPr>
+        <w:t xml:space="preserve">This is line 2 of page 8. Lorem ipsum dolor sit amet, consectetur adipiscing elit. Sed do </w:t>
+      </w:r>
+    </w:p>
+    <w:p>
+      <w:r>
+        <w:rPr>
+          <w:sz w:val="20"/>
+        </w:rPr>
+        <w:t xml:space="preserve">This is line 3 of page 8. Lorem ipsum dolor sit amet, consectetur adipiscing elit. Sed do </w:t>
+      </w:r>
+    </w:p>
+    <w:p>
+      <w:r>
+        <w:rPr>
+          <w:sz w:val="20"/>
+        </w:rPr>
+        <w:t xml:space="preserve">This is line 4 of page 8. Lorem ipsum dolor sit amet, consectetur adipiscing elit. Sed do </w:t>
+      </w:r>
+    </w:p>
+    <w:p>
+      <w:r>
+        <w:rPr>
+          <w:sz w:val="20"/>
+        </w:rPr>
+        <w:t xml:space="preserve">This is line 5 of page 8. Lorem ipsum dolor sit amet, consectetur adipiscing elit. Sed do </w:t>
+      </w:r>
+    </w:p>
+    <w:p>
+      <w:r>
+        <w:rPr>
+          <w:sz w:val="20"/>
+        </w:rPr>
+        <w:t xml:space="preserve">This is line 6 of page 8. Lorem ipsum dolor sit amet, consectetur adipiscing elit. Sed do </w:t>
+      </w:r>
+    </w:p>
+    <w:p>
+      <w:r>
+        <w:rPr>
+          <w:sz w:val="20"/>
+        </w:rPr>
+        <w:t xml:space="preserve">This is line 7 of page 8. Lorem ipsum dolor sit amet, consectetur adipiscing elit. Sed do </w:t>
+      </w:r>
+    </w:p>
+    <w:p>
+      <w:r>
+        <w:rPr>
+          <w:sz w:val="20"/>
+        </w:rPr>
+        <w:t xml:space="preserve">This is line 8 of page 8. Lorem ipsum dolor sit amet, consectetur adipiscing elit. Sed do </w:t>
       </w:r>
     </w:p>
     <w:p>
@@ -1570,7 +1570,7 @@
         <w:rPr>
           <w:sz w:val="19"/>
         </w:rPr>
-        <w:t>This is line 9 of page 8. Lorem ipsum dolor sit amet, consectetur adipiscing elit. Sed do</w:t>
+        <w:t xml:space="preserve">This is line 9 of page 8. Lorem ipsum dolor sit amet, consectetur adipiscing elit. Sed do </w:t>
       </w:r>
     </w:p>
     <w:p>
@@ -1719,63 +1719,63 @@
         <w:rPr>
           <w:sz w:val="20"/>
         </w:rPr>
-        <w:t>This is line 1 of page 9. Lorem ipsum dolor sit amet, consectetur adipiscing elit. Sed do</w:t>
-      </w:r>
-    </w:p>
-    <w:p>
-      <w:r>
-        <w:rPr>
-          <w:sz w:val="20"/>
-        </w:rPr>
-        <w:t>This is line 2 of page 9. Lorem ipsum dolor sit amet, consectetur adipiscing elit. Sed do</w:t>
-      </w:r>
-    </w:p>
-    <w:p>
-      <w:r>
-        <w:rPr>
-          <w:sz w:val="20"/>
-        </w:rPr>
-        <w:t>This is line 3 of page 9. Lorem ipsum dolor sit amet, consectetur adipiscing elit. Sed do</w:t>
-      </w:r>
-    </w:p>
-    <w:p>
-      <w:r>
-        <w:rPr>
-          <w:sz w:val="20"/>
-        </w:rPr>
-        <w:t>This is line 4 of page 9. Lorem ipsum dolor sit amet, consectetur adipiscing elit. Sed do</w:t>
-      </w:r>
-    </w:p>
-    <w:p>
-      <w:r>
-        <w:rPr>
-          <w:sz w:val="20"/>
-        </w:rPr>
-        <w:t>This is line 5 of page 9. Lorem ipsum dolor sit amet, consectetur adipiscing elit. Sed do</w:t>
-      </w:r>
-    </w:p>
-    <w:p>
-      <w:r>
-        <w:rPr>
-          <w:sz w:val="20"/>
-        </w:rPr>
-        <w:t>This is line 6 of page 9. Lorem ipsum dolor sit amet, consectetur adipiscing elit. Sed do</w:t>
-      </w:r>
-    </w:p>
-    <w:p>
-      <w:r>
-        <w:rPr>
-          <w:sz w:val="20"/>
-        </w:rPr>
-        <w:t>This is line 7 of page 9. Lorem ipsum dolor sit amet, consectetur adipiscing elit. Sed do</w:t>
-      </w:r>
-    </w:p>
-    <w:p>
-      <w:r>
-        <w:rPr>
-          <w:sz w:val="20"/>
-        </w:rPr>
-        <w:t>This is line 8 of page 9. Lorem ipsum dolor sit amet, consectetur adipiscing elit. Sed do</w:t>
+        <w:t xml:space="preserve">This is line 1 of page 9. Lorem ipsum dolor sit amet, consectetur adipiscing elit. Sed do </w:t>
+      </w:r>
+    </w:p>
+    <w:p>
+      <w:r>
+        <w:rPr>
+          <w:sz w:val="20"/>
+        </w:rPr>
+        <w:t xml:space="preserve">This is line 2 of page 9. Lorem ipsum dolor sit amet, consectetur adipiscing elit. Sed do </w:t>
+      </w:r>
+    </w:p>
+    <w:p>
+      <w:r>
+        <w:rPr>
+          <w:sz w:val="20"/>
+        </w:rPr>
+        <w:t xml:space="preserve">This is line 3 of page 9. Lorem ipsum dolor sit amet, consectetur adipiscing elit. Sed do </w:t>
+      </w:r>
+    </w:p>
+    <w:p>
+      <w:r>
+        <w:rPr>
+          <w:sz w:val="20"/>
+        </w:rPr>
+        <w:t xml:space="preserve">This is line 4 of page 9. Lorem ipsum dolor sit amet, consectetur adipiscing elit. Sed do </w:t>
+      </w:r>
+    </w:p>
+    <w:p>
+      <w:r>
+        <w:rPr>
+          <w:sz w:val="20"/>
+        </w:rPr>
+        <w:t xml:space="preserve">This is line 5 of page 9. Lorem ipsum dolor sit amet, consectetur adipiscing elit. Sed do </w:t>
+      </w:r>
+    </w:p>
+    <w:p>
+      <w:r>
+        <w:rPr>
+          <w:sz w:val="20"/>
+        </w:rPr>
+        <w:t xml:space="preserve">This is line 6 of page 9. Lorem ipsum dolor sit amet, consectetur adipiscing elit. Sed do </w:t>
+      </w:r>
+    </w:p>
+    <w:p>
+      <w:r>
+        <w:rPr>
+          <w:sz w:val="20"/>
+        </w:rPr>
+        <w:t xml:space="preserve">This is line 7 of page 9. Lorem ipsum dolor sit amet, consectetur adipiscing elit. Sed do </w:t>
+      </w:r>
+    </w:p>
+    <w:p>
+      <w:r>
+        <w:rPr>
+          <w:sz w:val="20"/>
+        </w:rPr>
+        <w:t xml:space="preserve">This is line 8 of page 9. Lorem ipsum dolor sit amet, consectetur adipiscing elit. Sed do </w:t>
       </w:r>
     </w:p>
     <w:p>
@@ -1783,7 +1783,7 @@
         <w:rPr>
           <w:sz w:val="19"/>
         </w:rPr>
-        <w:t>This is line 9 of page 9. Lorem ipsum dolor sit amet, consectetur adipiscing elit. Sed do</w:t>
+        <w:t xml:space="preserve">This is line 9 of page 9. Lorem ipsum dolor sit amet, consectetur adipiscing elit. Sed do </w:t>
       </w:r>
     </w:p>
     <w:p>

</xml_diff>